<commit_message>
Mandato e Allegato B: provvigione e penali riscritte in linguaggio chiaro
Co-authored-by: Cursor <cursoragent@cursor.com>
</commit_message>
<xml_diff>
--- a/documenti/Allegato-B-Scheda-Informativa-Mandato-Esclusivo-Comproprieta.docx
+++ b/documenti/Allegato-B-Scheda-Informativa-Mandato-Esclusivo-Comproprieta.docx
@@ -25,7 +25,7 @@
           <w:b/>
           <w:sz w:val="24"/>
         </w:rPr>
-        <w:t>Allegato B — Scheda informativa per i comproprietari</w:t>
+        <w:t>Allegato B — Cosa sapere prima di firmare</w:t>
       </w:r>
     </w:p>
     <w:p>
@@ -38,7 +38,7 @@
           <w:b w:val="0"/>
           <w:sz w:val="22"/>
         </w:rPr>
-        <w:t>Mandato esclusivo di vendita</w:t>
+        <w:t>Mandato esclusivo · comproprietari</w:t>
       </w:r>
     </w:p>
     <w:p>
@@ -51,7 +51,7 @@
           <w:b w:val="0"/>
           <w:sz w:val="20"/>
         </w:rPr>
-        <w:t>Da leggere e firmare prima o insieme al contratto di incarico · revisione 21/07/2026</w:t>
+        <w:t>Revisione 21/07/2026</w:t>
       </w:r>
     </w:p>
     <w:p/>
@@ -62,7 +62,7 @@
           <w:b w:val="0"/>
           <w:sz w:val="22"/>
         </w:rPr>
-        <w:t>Questa pagina riassume, in linguaggio chiaro, i punti principali del mandato. Il testo completo e vincolante resta quello del contratto di mediazione sottoscritto in agenzia.</w:t>
+        <w:t>Questa scheda spiega in modo semplice le regole del mandato. Fa fede il contratto firmato in agenzia; qui trovi solo un riassunto per capire chi paga cosa.</w:t>
       </w:r>
     </w:p>
     <w:p/>
@@ -75,7 +75,211 @@
           <w:rFonts w:ascii="Times New Roman" w:hAnsi="Times New Roman"/>
           <w:color w:val="2C4A6E"/>
         </w:rPr>
-        <w:t>1. Provvigione — come si divide</w:t>
+        <w:t>1. La provvigione — chi paga quanto</w:t>
+      </w:r>
+    </w:p>
+    <w:p>
+      <w:r>
+        <w:rPr>
+          <w:rFonts w:ascii="Times New Roman" w:hAnsi="Times New Roman"/>
+          <w:b w:val="0"/>
+          <w:sz w:val="22"/>
+        </w:rPr>
+        <w:t>La provvigione dell'agenzia (es. 3% + IVA sul prezzo di vendita) si divide in base alla quota di proprietà di ciascuno.</w:t>
+      </w:r>
+    </w:p>
+    <w:tbl>
+      <w:tblPr>
+        <w:tblStyle w:val="TableGrid"/>
+        <w:tblW w:type="auto" w:w="0"/>
+        <w:tblLook w:firstColumn="1" w:firstRow="1" w:lastColumn="0" w:lastRow="0" w:noHBand="0" w:noVBand="1" w:val="04A0"/>
+      </w:tblPr>
+      <w:tblGrid>
+        <w:gridCol w:w="3135"/>
+        <w:gridCol w:w="3135"/>
+        <w:gridCol w:w="3135"/>
+      </w:tblGrid>
+      <w:tr>
+        <w:tc>
+          <w:tcPr>
+            <w:tcW w:type="dxa" w:w="3135"/>
+          </w:tcPr>
+          <w:p>
+            <w:r>
+              <w:t>Situazione</w:t>
+            </w:r>
+          </w:p>
+        </w:tc>
+        <w:tc>
+          <w:tcPr>
+            <w:tcW w:type="dxa" w:w="3135"/>
+          </w:tcPr>
+          <w:p>
+            <w:r>
+              <w:t>Chi paga</w:t>
+            </w:r>
+          </w:p>
+        </w:tc>
+        <w:tc>
+          <w:tcPr>
+            <w:tcW w:type="dxa" w:w="3135"/>
+          </w:tcPr>
+          <w:p>
+            <w:r>
+              <w:t>Quanto</w:t>
+            </w:r>
+          </w:p>
+        </w:tc>
+      </w:tr>
+      <w:tr>
+        <w:tc>
+          <w:tcPr>
+            <w:tcW w:type="dxa" w:w="3135"/>
+          </w:tcPr>
+          <w:p>
+            <w:r>
+              <w:t>Vendita conclusa e tutti firmano</w:t>
+            </w:r>
+          </w:p>
+        </w:tc>
+        <w:tc>
+          <w:tcPr>
+            <w:tcW w:type="dxa" w:w="3135"/>
+          </w:tcPr>
+          <w:p>
+            <w:r>
+              <w:t>Ogni comproprietario</w:t>
+            </w:r>
+          </w:p>
+        </w:tc>
+        <w:tc>
+          <w:tcPr>
+            <w:tcW w:type="dxa" w:w="3135"/>
+          </w:tcPr>
+          <w:p>
+            <w:r>
+              <w:t>Solo la propria parte (es. 1/3 se tre fratelli uguali)</w:t>
+            </w:r>
+          </w:p>
+        </w:tc>
+      </w:tr>
+      <w:tr>
+        <w:tc>
+          <w:tcPr>
+            <w:tcW w:type="dxa" w:w="3135"/>
+          </w:tcPr>
+          <w:p>
+            <w:r>
+              <w:t>Uno vuole vendere a prezzo pieno e firma</w:t>
+            </w:r>
+          </w:p>
+        </w:tc>
+        <w:tc>
+          <w:tcPr>
+            <w:tcW w:type="dxa" w:w="3135"/>
+          </w:tcPr>
+          <w:p>
+            <w:r>
+              <w:t>Chi firma</w:t>
+            </w:r>
+          </w:p>
+        </w:tc>
+        <w:tc>
+          <w:tcPr>
+            <w:tcW w:type="dxa" w:w="3135"/>
+          </w:tcPr>
+          <w:p>
+            <w:r>
+              <w:t>Solo la propria parte — non paga per gli altri</w:t>
+            </w:r>
+          </w:p>
+        </w:tc>
+      </w:tr>
+      <w:tr>
+        <w:tc>
+          <w:tcPr>
+            <w:tcW w:type="dxa" w:w="3135"/>
+          </w:tcPr>
+          <w:p>
+            <w:r>
+              <w:t>Uno si rifiuta di firmare a prezzo pieno senza motivo valido</w:t>
+            </w:r>
+          </w:p>
+        </w:tc>
+        <w:tc>
+          <w:tcPr>
+            <w:tcW w:type="dxa" w:w="3135"/>
+          </w:tcPr>
+          <w:p>
+            <w:r>
+              <w:t>Solo chi rifiuta</w:t>
+            </w:r>
+          </w:p>
+        </w:tc>
+        <w:tc>
+          <w:tcPr>
+            <w:tcW w:type="dxa" w:w="3135"/>
+          </w:tcPr>
+          <w:p>
+            <w:r>
+              <w:t>Penale = tutta la provvigione (100%)</w:t>
+            </w:r>
+          </w:p>
+        </w:tc>
+      </w:tr>
+      <w:tr>
+        <w:tc>
+          <w:tcPr>
+            <w:tcW w:type="dxa" w:w="3135"/>
+          </w:tcPr>
+          <w:p>
+            <w:r>
+              <w:t>Offerta sotto il prezzo del mandato</w:t>
+            </w:r>
+          </w:p>
+        </w:tc>
+        <w:tc>
+          <w:tcPr>
+            <w:tcW w:type="dxa" w:w="3135"/>
+          </w:tcPr>
+          <w:p>
+            <w:r>
+              <w:t>—</w:t>
+            </w:r>
+          </w:p>
+        </w:tc>
+        <w:tc>
+          <w:tcPr>
+            <w:tcW w:type="dxa" w:w="3135"/>
+          </w:tcPr>
+          <w:p>
+            <w:r>
+              <w:t>Nessuna penale; si può ridiscutere</w:t>
+            </w:r>
+          </w:p>
+        </w:tc>
+      </w:tr>
+    </w:tbl>
+    <w:p>
+      <w:r>
+        <w:rPr>
+          <w:rFonts w:ascii="Times New Roman" w:hAnsi="Times New Roman"/>
+          <w:b/>
+          <w:sz w:val="22"/>
+        </w:rPr>
+        <w:t>Esempio numerico: casa € 300.000, provvigione 3% = € 9.000 (+ IVA). Tre fratelli al 33,33% ciascuno → ognuno paga € 3.000 (+ IVA) se la vendita si chiude. Se uno solo si rifiuta di firmare a € 300.000 senza motivo valido → quello paga € 9.000 (+ IVA) all'agenzia a titolo di penale; gli altri no.</w:t>
+      </w:r>
+    </w:p>
+    <w:p>
+      <w:pPr>
+        <w:pStyle w:val="Heading2"/>
+      </w:pPr>
+      <w:r>
+        <w:rPr>
+          <w:rFonts w:ascii="Times New Roman" w:hAnsi="Times New Roman"/>
+          <w:color w:val="2C4A6E"/>
+        </w:rPr>
+        <w:t>2. Acquirente al prezzo del mandato</w:t>
       </w:r>
     </w:p>
     <w:p>
@@ -87,7 +291,7 @@
           <w:rFonts w:ascii="Times New Roman" w:hAnsi="Times New Roman"/>
           <w:sz w:val="22"/>
         </w:rPr>
-        <w:t>La provvigione dell'agenzia (es. 3% + IVA sul prezzo di vendita) si calcola sul prezzo effettivo concordato con l'acquirente.</w:t>
+        <w:t>Se l'agenzia trova un acquirente al prezzo del mandato (o superiore), tutti devono collaborare per chiudere (proposta, preliminare, rogito).</w:t>
       </w:r>
     </w:p>
     <w:p>
@@ -99,7 +303,7 @@
           <w:rFonts w:ascii="Times New Roman" w:hAnsi="Times New Roman"/>
           <w:sz w:val="22"/>
         </w:rPr>
-        <w:t>In caso di comproprietà, ogni proprietario paga la propria parte in base alla quota di proprietà (es. due fratelli al 50% → ciascuno metà della provvigione).</w:t>
+        <w:t>Non basta che uno solo sia d'accordo: servono tutti per vendere.</w:t>
       </w:r>
     </w:p>
     <w:p>
@@ -111,7 +315,19 @@
           <w:rFonts w:ascii="Times New Roman" w:hAnsi="Times New Roman"/>
           <w:sz w:val="22"/>
         </w:rPr>
-        <w:t>Ognuno è tenuto a corrispondere per intero (11/11) la propria quota: non si può pagare solo una frazione della propria parte.</w:t>
+        <w:t>Chi si rifiuta senza motivo serio documentato paga personalmente la penale pari all'intera provvigione.</w:t>
+      </w:r>
+    </w:p>
+    <w:p>
+      <w:pPr>
+        <w:pStyle w:val="ListBullet"/>
+      </w:pPr>
+      <w:r>
+        <w:rPr>
+          <w:rFonts w:ascii="Times New Roman" w:hAnsi="Times New Roman"/>
+          <w:sz w:val="22"/>
+        </w:rPr>
+        <w:t>Chi firma e collabora paga solo la propria quota, se la vendita si conclude.</w:t>
       </w:r>
     </w:p>
     <w:p>
@@ -123,80 +339,17 @@
           <w:rFonts w:ascii="Times New Roman" w:hAnsi="Times New Roman"/>
           <w:color w:val="2C4A6E"/>
         </w:rPr>
-        <w:t>2. Se c'è un acquirente al prezzo del mandato</w:t>
+        <w:t>3. Offerta più bassa del mandato</w:t>
       </w:r>
     </w:p>
     <w:p>
-      <w:pPr>
-        <w:ind w:left="283"/>
-      </w:pPr>
       <w:r>
         <w:rPr>
           <w:rFonts w:ascii="Times New Roman" w:hAnsi="Times New Roman"/>
-          <w:i/>
-          <w:sz w:val="21"/>
-        </w:rPr>
-        <w:t>In sintesi: se l'agenzia trova un acquirente disposto a pagare almeno il prezzo indicato nel mandato, tutti i comproprietari devono collaborare per concludere la vendita (proposta, preliminare, rogito).</w:t>
-      </w:r>
-    </w:p>
-    <w:p>
-      <w:pPr>
-        <w:pStyle w:val="ListBullet"/>
-      </w:pPr>
-      <w:r>
-        <w:rPr>
-          <w:rFonts w:ascii="Times New Roman" w:hAnsi="Times New Roman"/>
+          <w:b w:val="0"/>
           <w:sz w:val="22"/>
         </w:rPr>
-        <w:t>Non si può opporsi senza un motivo serio e documentato (es. vincoli legali, forza maggiore — non il semplice «ci ripenso»).</w:t>
-      </w:r>
-    </w:p>
-    <w:p>
-      <w:pPr>
-        <w:pStyle w:val="ListBullet"/>
-      </w:pPr>
-      <w:r>
-        <w:rPr>
-          <w:rFonts w:ascii="Times New Roman" w:hAnsi="Times New Roman"/>
-          <w:sz w:val="22"/>
-        </w:rPr>
-        <w:t>Chi si rifiuta di firmare in questa situazione risponde personalmente: deve pagare la provvigione maturata e la penale prevista dal contratto (pari al 100% / 11/11 della provvigione pattuita).</w:t>
-      </w:r>
-    </w:p>
-    <w:p>
-      <w:pPr>
-        <w:pStyle w:val="Heading2"/>
-      </w:pPr>
-      <w:r>
-        <w:rPr>
-          <w:rFonts w:ascii="Times New Roman" w:hAnsi="Times New Roman"/>
-          <w:color w:val="2C4A6E"/>
-        </w:rPr>
-        <w:t>3. Se il prezzo proposto è più basso del mandato</w:t>
-      </w:r>
-    </w:p>
-    <w:p>
-      <w:pPr>
-        <w:pStyle w:val="ListBullet"/>
-      </w:pPr>
-      <w:r>
-        <w:rPr>
-          <w:rFonts w:ascii="Times New Roman" w:hAnsi="Times New Roman"/>
-          <w:sz w:val="22"/>
-        </w:rPr>
-        <w:t>Ognuno resta libero di non accettare e di ridiscutere l'offerta con l'agenzia e con gli altri proprietari.</w:t>
-      </w:r>
-    </w:p>
-    <w:p>
-      <w:pPr>
-        <w:pStyle w:val="ListBullet"/>
-      </w:pPr>
-      <w:r>
-        <w:rPr>
-          <w:rFonts w:ascii="Times New Roman" w:hAnsi="Times New Roman"/>
-          <w:sz w:val="22"/>
-        </w:rPr>
-        <w:t>In questo caso non scattano penali né obbligo di provvigione per il solo rifiuto.</w:t>
+        <w:t>Se l'acquirente propone meno del prezzo del mandato (es. mandato € 300.000, offerta € 280.000), ognuno è libero di non firmare e di ridiscutere. Nessuna penale e nessuna provvigione solo per il rifiuto.</w:t>
       </w:r>
     </w:p>
     <w:p>
@@ -220,7 +373,7 @@
           <w:rFonts w:ascii="Times New Roman" w:hAnsi="Times New Roman"/>
           <w:sz w:val="22"/>
         </w:rPr>
-        <w:t>L'agenzia organizzerà le visite con gli acquirenti per almeno un giorno a settimana, da concordare all'inizio (giorno e fasce orarie).</w:t>
+        <w:t>Almeno un giorno a settimana per le visite, concordato all'inizio.</w:t>
       </w:r>
     </w:p>
     <w:p>
@@ -232,7 +385,7 @@
           <w:rFonts w:ascii="Times New Roman" w:hAnsi="Times New Roman"/>
           <w:sz w:val="22"/>
         </w:rPr>
-        <w:t>Se un comproprietario risiede nell'immobile, deve garantire l'accesso in quel giorno, salvo diverso accordo scritto.</w:t>
+        <w:t>Chi vive nell'immobile deve permettere l'accesso, salvo accordo diverso scritto.</w:t>
       </w:r>
     </w:p>
     <w:p>
@@ -244,7 +397,7 @@
           <w:rFonts w:ascii="Times New Roman" w:hAnsi="Times New Roman"/>
           <w:sz w:val="22"/>
         </w:rPr>
-        <w:t>Se in quel giorno non è possibile per giusta causa (malattia, emergenza, impegno imprevisto), va comunicato subito all'agenzia per fissare un altro appuntamento.</w:t>
+        <w:t>Impossibilità per motivo serio: avvisare subito l'agenzia e fissare altro appuntamento.</w:t>
       </w:r>
     </w:p>
     <w:p>
@@ -256,7 +409,7 @@
           <w:rFonts w:ascii="Times New Roman" w:hAnsi="Times New Roman"/>
           <w:sz w:val="22"/>
         </w:rPr>
-        <w:t>Bloccare le visite senza motivo valido può comportare penali e inadempimento contrattuale.</w:t>
+        <w:t>Bloccare le visite senza motivo può comportare penali.</w:t>
       </w:r>
     </w:p>
     <w:p>
@@ -268,7 +421,7 @@
           <w:rFonts w:ascii="Times New Roman" w:hAnsi="Times New Roman"/>
           <w:color w:val="2C4A6E"/>
         </w:rPr>
-        <w:t>5. Documenti, preliminare e consegna</w:t>
+        <w:t>5. Documenti, preliminare, consegna</w:t>
       </w:r>
     </w:p>
     <w:p>
@@ -280,7 +433,7 @@
           <w:rFonts w:ascii="Times New Roman" w:hAnsi="Times New Roman"/>
           <w:sz w:val="22"/>
         </w:rPr>
-        <w:t>Dall'accordo con l'acquirente (proposta accettata o preliminare), tutti devono mettere a disposizione la documentazione catastale e urbanistica completa (planimetrie, APE, eventuali regolarizzazioni).</w:t>
+        <w:t>Dall'accordo con l'acquirente: documenti catastali e urbanistici completi.</w:t>
       </w:r>
     </w:p>
     <w:p>
@@ -292,7 +445,7 @@
           <w:rFonts w:ascii="Times New Roman" w:hAnsi="Times New Roman"/>
           <w:sz w:val="22"/>
         </w:rPr>
-        <w:t>L'agenzia può assistere nella stipula del contratto preliminare; chi firma si impegna a rispettare quanto concordato.</w:t>
+        <w:t>Preliminare: chi firma si impegna a rispettare quanto concordato.</w:t>
       </w:r>
     </w:p>
     <w:p>
@@ -304,7 +457,7 @@
           <w:rFonts w:ascii="Times New Roman" w:hAnsi="Times New Roman"/>
           <w:sz w:val="22"/>
         </w:rPr>
-        <w:t>Dopo il preliminare, la consegna dell'immobile all'acquirente deve avvenire entro 6 mesi, salvo diverso accordo scritto tra tutte le parti.</w:t>
+        <w:t>Consegna casa all'acquirente entro 6 mesi dal preliminare, salvo altro accordo scritto.</w:t>
       </w:r>
     </w:p>
     <w:p>
@@ -320,16 +473,25 @@
       </w:r>
     </w:p>
     <w:p>
+      <w:r>
+        <w:rPr>
+          <w:rFonts w:ascii="Times New Roman" w:hAnsi="Times New Roman"/>
+          <w:b w:val="0"/>
+          <w:sz w:val="22"/>
+        </w:rPr>
+        <w:t>Se chi abita in casa, senza motivi previsti dal contratto, non consente visite o consegna, risponde di spese e danni verso acquirenti e agenzia. Con preliminare già firmato, possono valere anche le regole del preliminare (es. doppia caparra all'acquirente, ove previsto).</w:t>
+      </w:r>
+    </w:p>
+    <w:p>
       <w:pPr>
-        <w:ind w:left="283"/>
+        <w:pStyle w:val="Heading2"/>
       </w:pPr>
       <w:r>
         <w:rPr>
           <w:rFonts w:ascii="Times New Roman" w:hAnsi="Times New Roman"/>
-          <w:i/>
-          <w:sz w:val="21"/>
+          <w:color w:val="2C4A6E"/>
         </w:rPr>
-        <w:t>Se il comproprietario residente, senza motivi previsti dal contratto, non consente visite, liberazione o consegna nei termini concordati, risponde delle spese e dei danni che ne derivano verso acquirenti e agenzia.</w:t>
+        <w:t>7. Prima di firmare</w:t>
       </w:r>
     </w:p>
     <w:p>
@@ -341,19 +503,7 @@
           <w:rFonts w:ascii="Times New Roman" w:hAnsi="Times New Roman"/>
           <w:sz w:val="22"/>
         </w:rPr>
-        <w:t>Se è già stato firmato un preliminare e l'inadempimento è imputabile a chi abita in casa, potranno applicarsi anche le conseguenze previste dal preliminare — tra cui, ove previsto dalla legge e dal contratto con l'acquirente, la restituzione del doppio della caparra — oltre alla provvigione dovuta all'agenzia.</w:t>
-      </w:r>
-    </w:p>
-    <w:p>
-      <w:pPr>
-        <w:pStyle w:val="Heading2"/>
-      </w:pPr>
-      <w:r>
-        <w:rPr>
-          <w:rFonts w:ascii="Times New Roman" w:hAnsi="Times New Roman"/>
-          <w:color w:val="2C4A6E"/>
-        </w:rPr>
-        <w:t>7. Cosa conviene fare prima di firmare</w:t>
+        <w:t>Controllare Allegato A (nomi e quote).</w:t>
       </w:r>
     </w:p>
     <w:p>
@@ -365,7 +515,7 @@
           <w:rFonts w:ascii="Times New Roman" w:hAnsi="Times New Roman"/>
           <w:sz w:val="22"/>
         </w:rPr>
-        <w:t>Verificare che l'elenco comproprietari e quote (Allegato A) sia corretto.</w:t>
+        <w:t>Concordare il giorno delle visite se qualcuno abita in casa.</w:t>
       </w:r>
     </w:p>
     <w:p>
@@ -377,7 +527,7 @@
           <w:rFonts w:ascii="Times New Roman" w:hAnsi="Times New Roman"/>
           <w:sz w:val="22"/>
         </w:rPr>
-        <w:t>Concordare subito il giorno settimanale per le visite se qualcuno abita nell'immobile.</w:t>
+        <w:t>Segnalare ipoteche o vincoli sulla propria quota.</w:t>
       </w:r>
     </w:p>
     <w:p>
@@ -389,19 +539,7 @@
           <w:rFonts w:ascii="Times New Roman" w:hAnsi="Times New Roman"/>
           <w:sz w:val="22"/>
         </w:rPr>
-        <w:t>Comunicare all'agenzia ipoteche, pignoramenti o altri vincoli sulla propria quota, se presenti.</w:t>
-      </w:r>
-    </w:p>
-    <w:p>
-      <w:pPr>
-        <w:pStyle w:val="ListBullet"/>
-      </w:pPr>
-      <w:r>
-        <w:rPr>
-          <w:rFonts w:ascii="Times New Roman" w:hAnsi="Times New Roman"/>
-          <w:sz w:val="22"/>
-        </w:rPr>
-        <w:t>Chiarire dubbi in agenzia: 049.8843484 · info@righettoimmobiliare.it</w:t>
+        <w:t>Dubbi? 049.8843484 · info@righettoimmobiliare.it</w:t>
       </w:r>
     </w:p>
     <w:p/>
@@ -412,7 +550,7 @@
           <w:b/>
           <w:sz w:val="22"/>
         </w:rPr>
-        <w:t>Dichiarazione di presa visione — Dichiaro di aver ricevuto e letto la presente scheda informativa e di aver avuto modo di porre domande in agenzia prima della sottoscrizione del mandato esclusivo.</w:t>
+        <w:t>Dichiarazione — Dichiaro di aver letto questa scheda e di aver potuto fare domande in agenzia prima di firmare il mandato.</w:t>
       </w:r>
     </w:p>
     <w:p/>
@@ -547,7 +685,7 @@
           <w:b w:val="0"/>
           <w:sz w:val="18"/>
         </w:rPr>
-        <w:t>Documento interno Righetto Immobiliare — revisione 21/07/2026. Allegato B informativo, non sostitutivo del contratto di mediazione. Verificare con consulenza legale/notarile prima dell'uso operativo.</w:t>
+        <w:t>Allegato B informativo — revisione 21/07/2026. Non sostituisce il contratto di mediazione.</w:t>
       </w:r>
     </w:p>
     <w:sectPr>

</xml_diff>